<commit_message>
transaksi dan progress lelang
</commit_message>
<xml_diff>
--- a/src/app/dashboard/surat/components/templates/template_mou_selisihharga.docx
+++ b/src/app/dashboard/surat/components/templates/template_mou_selisihharga.docx
@@ -6594,7 +6594,7 @@
           <w:bCs/>
           <w:color w:val="1A1A2E"/>
         </w:rPr>
-        <w:t>4.1</w:t>
+        <w:t xml:space="preserve">4.1</w:t>
       </w:r>
       <w:r>
         <w:rPr>
@@ -6602,179 +6602,41 @@
         </w:rPr>
         <w:t xml:space="preserve">  </w:t>
       </w:r>
-      <w:proofErr w:type="spellStart"/>
-      <w:r>
-        <w:rPr>
-          <w:b/>
-          <w:bCs/>
-          <w:color w:val="1A1A2E"/>
-        </w:rPr>
-        <w:t>Titipan</w:t>
-      </w:r>
-      <w:proofErr w:type="spellEnd"/>
-      <w:r>
-        <w:rPr>
-          <w:b/>
-          <w:bCs/>
-          <w:color w:val="1A1A2E"/>
-        </w:rPr>
-        <w:t xml:space="preserve"> </w:t>
-      </w:r>
-      <w:proofErr w:type="spellStart"/>
-      <w:r>
-        <w:rPr>
-          <w:b/>
-          <w:bCs/>
-          <w:color w:val="1A1A2E"/>
-        </w:rPr>
-        <w:t>Biaya</w:t>
-      </w:r>
-      <w:proofErr w:type="spellEnd"/>
-      <w:r>
-        <w:rPr>
-          <w:b/>
-          <w:bCs/>
-          <w:color w:val="1A1A2E"/>
-        </w:rPr>
-        <w:t xml:space="preserve"> </w:t>
-      </w:r>
-      <w:proofErr w:type="spellStart"/>
-      <w:r>
-        <w:rPr>
-          <w:b/>
-          <w:bCs/>
-          <w:color w:val="1A1A2E"/>
-        </w:rPr>
-        <w:t>Awal</w:t>
-      </w:r>
-      <w:proofErr w:type="spellEnd"/>
-      <w:r>
-        <w:rPr>
-          <w:color w:val="1A1A2E"/>
-        </w:rPr>
-        <w:t xml:space="preserve">: </w:t>
-      </w:r>
-      <w:r>
-        <w:rPr>
-          <w:b/>
-          <w:bCs/>
-          <w:color w:val="1A1A2E"/>
-        </w:rPr>
-        <w:t>PIHAK PERTAMA</w:t>
-      </w:r>
-      <w:r>
-        <w:rPr>
-          <w:color w:val="1A1A2E"/>
-        </w:rPr>
-        <w:t xml:space="preserve"> </w:t>
-      </w:r>
-      <w:proofErr w:type="spellStart"/>
-      <w:r>
-        <w:rPr>
-          <w:color w:val="1A1A2E"/>
-        </w:rPr>
-        <w:t>menyerahkan</w:t>
-      </w:r>
-      <w:proofErr w:type="spellEnd"/>
-      <w:r>
-        <w:rPr>
-          <w:color w:val="1A1A2E"/>
-        </w:rPr>
-        <w:t xml:space="preserve"> </w:t>
-      </w:r>
-      <w:proofErr w:type="spellStart"/>
-      <w:r>
-        <w:rPr>
-          <w:color w:val="1A1A2E"/>
-        </w:rPr>
-        <w:t>titipan</w:t>
-      </w:r>
-      <w:proofErr w:type="spellEnd"/>
-      <w:r>
-        <w:rPr>
-          <w:color w:val="1A1A2E"/>
-        </w:rPr>
-        <w:t xml:space="preserve"> </w:t>
-      </w:r>
-      <w:proofErr w:type="spellStart"/>
-      <w:r>
-        <w:rPr>
-          <w:color w:val="1A1A2E"/>
-        </w:rPr>
-        <w:t>biaya</w:t>
-      </w:r>
-      <w:proofErr w:type="spellEnd"/>
-      <w:r>
-        <w:rPr>
-          <w:color w:val="1A1A2E"/>
-        </w:rPr>
-        <w:t xml:space="preserve"> </w:t>
-      </w:r>
-      <w:proofErr w:type="spellStart"/>
-      <w:r>
-        <w:rPr>
-          <w:color w:val="1A1A2E"/>
-        </w:rPr>
-        <w:t>sebesar</w:t>
-      </w:r>
-      <w:proofErr w:type="spellEnd"/>
-      <w:r>
-        <w:rPr>
-          <w:color w:val="1A1A2E"/>
-        </w:rPr>
-        <w:t xml:space="preserve"> </w:t>
-      </w:r>
-      <w:proofErr w:type="spellStart"/>
-      <w:r>
-        <w:rPr>
-          <w:b/>
-          <w:bCs/>
-          <w:color w:val="1A1A2E"/>
-        </w:rPr>
-        <w:t>Rp</w:t>
-      </w:r>
-      <w:proofErr w:type="spellEnd"/>
-      <w:r>
-        <w:rPr>
-          <w:b/>
-          <w:bCs/>
-          <w:color w:val="1A1A2E"/>
-        </w:rPr>
-        <w:t>.</w:t>
-      </w:r>
-      <w:r>
-        <w:rPr>
-          <w:b/>
-          <w:bCs/>
-          <w:color w:val="1A1A2E"/>
-        </w:rPr>
-        <w:t xml:space="preserve"> </w:t>
-      </w:r>
-      <w:r>
-        <w:rPr>
-          <w:b/>
-          <w:bCs/>
-          <w:color w:val="1A1A2E"/>
-        </w:rPr>
-        <w:t>{{</w:t>
-      </w:r>
-      <w:proofErr w:type="spellStart"/>
-      <w:r>
-        <w:rPr>
-          <w:b/>
-          <w:bCs/>
-          <w:color w:val="1A1A2E"/>
-        </w:rPr>
-        <w:t>uang_tanda_jaminan</w:t>
-      </w:r>
-      <w:proofErr w:type="spellEnd"/>
-      <w:r>
-        <w:rPr>
-          <w:b/>
-          <w:bCs/>
-          <w:color w:val="1A1A2E"/>
-        </w:rPr>
-        <w:t>}}</w:t>
+      <w:r>
+        <w:rPr>
+          <w:color w:val="1A1A2E"/>
+        </w:rPr>
+        <w:t xml:space="preserve">PIHAK PERTAMA akan memberikan titipan biaya dalam bentuk tunai/cek kepada </w:t>
+      </w:r>
+      <w:r>
+        <w:rPr>
+          <w:b/>
+          <w:bCs/>
+          <w:color w:val="1A1A2E"/>
+        </w:rPr>
+        <w:t xml:space="preserve">PIHAK KEDUA</w:t>
+      </w:r>
+      <w:r>
+        <w:rPr>
+          <w:color w:val="1A1A2E"/>
+        </w:rPr>
+        <w:t xml:space="preserve"> sebesar </w:t>
+      </w:r>
+      <w:r>
+        <w:rPr>
+          <w:b/>
+          <w:bCs/>
+          <w:color w:val="1A1A2E"/>
+        </w:rPr>
+        <w:t xml:space="preserve">Rp. </w:t>
+      </w:r>
+      <w:r>
+        <w:rPr>
+          <w:b/>
+          <w:bCs/>
+          <w:color w:val="1A1A2E"/>
+        </w:rPr>
+        <w:t xml:space="preserve">{{titipan_biaya}}</w:t>
       </w:r>
       <w:r>
         <w:rPr>
@@ -6786,237 +6648,83 @@
         <w:rPr>
           <w:color w:val="1A1A2E"/>
         </w:rPr>
-        <w:t>{{</w:t>
-      </w:r>
-      <w:proofErr w:type="spellStart"/>
-      <w:r>
-        <w:rPr>
-          <w:color w:val="1A1A2E"/>
-        </w:rPr>
-        <w:t>terbilang_uang_tanda_jaminan</w:t>
-      </w:r>
-      <w:proofErr w:type="spellEnd"/>
-      <w:r>
-        <w:rPr>
-          <w:color w:val="1A1A2E"/>
-        </w:rPr>
-        <w:t>}}</w:t>
-      </w:r>
-      <w:r>
-        <w:rPr>
-          <w:color w:val="1A1A2E"/>
-        </w:rPr>
-        <w:t xml:space="preserve">) </w:t>
-      </w:r>
-      <w:proofErr w:type="spellStart"/>
-      <w:r>
-        <w:rPr>
-          <w:color w:val="1A1A2E"/>
-        </w:rPr>
-        <w:t>kepada</w:t>
-      </w:r>
-      <w:proofErr w:type="spellEnd"/>
-      <w:r>
-        <w:rPr>
-          <w:color w:val="1A1A2E"/>
-        </w:rPr>
-        <w:t xml:space="preserve"> </w:t>
-      </w:r>
-      <w:r>
-        <w:rPr>
-          <w:b/>
-          <w:bCs/>
-          <w:color w:val="1A1A2E"/>
-        </w:rPr>
-        <w:t>PIHAK KEDUA</w:t>
-      </w:r>
-      <w:r>
-        <w:rPr>
-          <w:color w:val="1A1A2E"/>
-        </w:rPr>
-        <w:t xml:space="preserve"> </w:t>
-      </w:r>
-      <w:proofErr w:type="spellStart"/>
-      <w:r>
-        <w:rPr>
-          <w:color w:val="1A1A2E"/>
-        </w:rPr>
-        <w:t>segera</w:t>
-      </w:r>
-      <w:proofErr w:type="spellEnd"/>
-      <w:r>
-        <w:rPr>
-          <w:color w:val="1A1A2E"/>
-        </w:rPr>
-        <w:t xml:space="preserve"> </w:t>
-      </w:r>
-      <w:proofErr w:type="spellStart"/>
-      <w:r>
-        <w:rPr>
-          <w:color w:val="1A1A2E"/>
-        </w:rPr>
-        <w:t>setelah</w:t>
-      </w:r>
-      <w:proofErr w:type="spellEnd"/>
-      <w:r>
-        <w:rPr>
-          <w:color w:val="1A1A2E"/>
-        </w:rPr>
-        <w:t xml:space="preserve"> </w:t>
-      </w:r>
-      <w:proofErr w:type="spellStart"/>
-      <w:r>
-        <w:rPr>
-          <w:color w:val="1A1A2E"/>
-        </w:rPr>
-        <w:t>Perjanjian</w:t>
-      </w:r>
-      <w:proofErr w:type="spellEnd"/>
-      <w:r>
-        <w:rPr>
-          <w:color w:val="1A1A2E"/>
-        </w:rPr>
-        <w:t xml:space="preserve"> </w:t>
-      </w:r>
-      <w:proofErr w:type="spellStart"/>
-      <w:r>
-        <w:rPr>
-          <w:color w:val="1A1A2E"/>
-        </w:rPr>
-        <w:t>ini</w:t>
-      </w:r>
-      <w:proofErr w:type="spellEnd"/>
-      <w:r>
-        <w:rPr>
-          <w:color w:val="1A1A2E"/>
-        </w:rPr>
-        <w:t xml:space="preserve"> </w:t>
-      </w:r>
-      <w:proofErr w:type="spellStart"/>
-      <w:r>
-        <w:rPr>
-          <w:color w:val="1A1A2E"/>
-        </w:rPr>
-        <w:t>ditandatangani</w:t>
-      </w:r>
-      <w:proofErr w:type="spellEnd"/>
-      <w:r>
-        <w:rPr>
-          <w:color w:val="1A1A2E"/>
-        </w:rPr>
-        <w:t xml:space="preserve">. Dana </w:t>
-      </w:r>
-      <w:proofErr w:type="spellStart"/>
-      <w:r>
-        <w:rPr>
-          <w:color w:val="1A1A2E"/>
-        </w:rPr>
-        <w:t>ini</w:t>
-      </w:r>
-      <w:proofErr w:type="spellEnd"/>
-      <w:r>
-        <w:rPr>
-          <w:color w:val="1A1A2E"/>
-        </w:rPr>
-        <w:t xml:space="preserve"> </w:t>
-      </w:r>
-      <w:proofErr w:type="spellStart"/>
-      <w:r>
-        <w:rPr>
-          <w:color w:val="1A1A2E"/>
-        </w:rPr>
-        <w:t>dipergunakan</w:t>
-      </w:r>
-      <w:proofErr w:type="spellEnd"/>
-      <w:r>
-        <w:rPr>
-          <w:color w:val="1A1A2E"/>
-        </w:rPr>
-        <w:t xml:space="preserve"> </w:t>
-      </w:r>
-      <w:proofErr w:type="spellStart"/>
-      <w:r>
-        <w:rPr>
-          <w:color w:val="1A1A2E"/>
-        </w:rPr>
-        <w:t>untuk</w:t>
-      </w:r>
-      <w:proofErr w:type="spellEnd"/>
-      <w:r>
-        <w:rPr>
-          <w:color w:val="1A1A2E"/>
-        </w:rPr>
-        <w:t xml:space="preserve"> </w:t>
-      </w:r>
-      <w:proofErr w:type="spellStart"/>
-      <w:r>
-        <w:rPr>
-          <w:color w:val="1A1A2E"/>
-        </w:rPr>
-        <w:t>keperluan</w:t>
-      </w:r>
-      <w:proofErr w:type="spellEnd"/>
-      <w:r>
-        <w:rPr>
-          <w:color w:val="1A1A2E"/>
-        </w:rPr>
-        <w:t xml:space="preserve"> yang </w:t>
-      </w:r>
-      <w:proofErr w:type="spellStart"/>
-      <w:r>
-        <w:rPr>
-          <w:color w:val="1A1A2E"/>
-        </w:rPr>
-        <w:t>berkaitan</w:t>
-      </w:r>
-      <w:proofErr w:type="spellEnd"/>
-      <w:r>
-        <w:rPr>
-          <w:color w:val="1A1A2E"/>
-        </w:rPr>
-        <w:t xml:space="preserve"> </w:t>
-      </w:r>
-      <w:proofErr w:type="spellStart"/>
-      <w:r>
-        <w:rPr>
-          <w:color w:val="1A1A2E"/>
-        </w:rPr>
-        <w:t>dengan</w:t>
-      </w:r>
-      <w:proofErr w:type="spellEnd"/>
-      <w:r>
-        <w:rPr>
-          <w:color w:val="1A1A2E"/>
-        </w:rPr>
-        <w:t xml:space="preserve"> </w:t>
-      </w:r>
-      <w:proofErr w:type="spellStart"/>
-      <w:r>
-        <w:rPr>
-          <w:color w:val="1A1A2E"/>
-        </w:rPr>
-        <w:t>pelaksanaan</w:t>
-      </w:r>
-      <w:proofErr w:type="spellEnd"/>
-      <w:r>
-        <w:rPr>
-          <w:color w:val="1A1A2E"/>
-        </w:rPr>
-        <w:t xml:space="preserve"> </w:t>
-      </w:r>
-      <w:proofErr w:type="spellStart"/>
-      <w:r>
-        <w:rPr>
-          <w:color w:val="1A1A2E"/>
-        </w:rPr>
-        <w:t>lelang</w:t>
-      </w:r>
-      <w:proofErr w:type="spellEnd"/>
-      <w:r>
-        <w:rPr>
-          <w:color w:val="1A1A2E"/>
-        </w:rPr>
-        <w:t>.</w:t>
+        <w:t xml:space="preserve">{{terbilang_titipan_biaya}}</w:t>
+      </w:r>
+      <w:r>
+        <w:rPr>
+          <w:color w:val="1A1A2E"/>
+        </w:rPr>
+        <w:t xml:space="preserve">) yang akan diperlukan oleh </w:t>
+      </w:r>
+      <w:r>
+        <w:rPr>
+          <w:b/>
+          <w:bCs/>
+          <w:color w:val="1A1A2E"/>
+        </w:rPr>
+        <w:t xml:space="preserve">PIHAK KEDUA</w:t>
+      </w:r>
+      <w:r>
+        <w:rPr>
+          <w:color w:val="1A1A2E"/>
+        </w:rPr>
+        <w:t xml:space="preserve"> mengurus hal-hal berkaitan dengan lelang apabila </w:t>
+      </w:r>
+      <w:r>
+        <w:rPr>
+          <w:b/>
+          <w:bCs/>
+          <w:color w:val="1A1A2E"/>
+        </w:rPr>
+        <w:t xml:space="preserve">PIHAK PERTAMA</w:t>
+      </w:r>
+      <w:r>
+        <w:rPr>
+          <w:color w:val="1A1A2E"/>
+        </w:rPr>
+        <w:t xml:space="preserve"> berhasil menang lelang, cek/tunai tersebut akan diberikan oleh </w:t>
+      </w:r>
+      <w:r>
+        <w:rPr>
+          <w:b/>
+          <w:bCs/>
+          <w:color w:val="1A1A2E"/>
+        </w:rPr>
+        <w:t xml:space="preserve">PIHAK PERTAMA</w:t>
+      </w:r>
+      <w:r>
+        <w:rPr>
+          <w:color w:val="1A1A2E"/>
+        </w:rPr>
+        <w:t xml:space="preserve"> kepada </w:t>
+      </w:r>
+      <w:r>
+        <w:rPr>
+          <w:b/>
+          <w:bCs/>
+          <w:color w:val="1A1A2E"/>
+        </w:rPr>
+        <w:t xml:space="preserve">PIHAK KEDUA</w:t>
+      </w:r>
+      <w:r>
+        <w:rPr>
+          <w:color w:val="1A1A2E"/>
+        </w:rPr>
+        <w:t xml:space="preserve"> setelah Perjanjian ini selesai ditandatangani oleh </w:t>
+      </w:r>
+      <w:r>
+        <w:rPr>
+          <w:b/>
+          <w:bCs/>
+          <w:color w:val="1A1A2E"/>
+        </w:rPr>
+        <w:t xml:space="preserve">KEDUA BELAH PIHAK</w:t>
+      </w:r>
+      <w:r>
+        <w:rPr>
+          <w:color w:val="1A1A2E"/>
+        </w:rPr>
+        <w:t xml:space="preserve">.</w:t>
       </w:r>
     </w:p>
     <w:p>
@@ -7036,7 +6744,7 @@
           <w:bCs/>
           <w:color w:val="1A1A2E"/>
         </w:rPr>
-        <w:t>4.2</w:t>
+        <w:t xml:space="preserve">4.2</w:t>
       </w:r>
       <w:r>
         <w:rPr>
@@ -7044,207 +6752,41 @@
         </w:rPr>
         <w:t xml:space="preserve">  </w:t>
       </w:r>
-      <w:proofErr w:type="spellStart"/>
-      <w:r>
-        <w:rPr>
-          <w:b/>
-          <w:bCs/>
-          <w:color w:val="1A1A2E"/>
-        </w:rPr>
-        <w:t>Uang</w:t>
-      </w:r>
-      <w:proofErr w:type="spellEnd"/>
-      <w:r>
-        <w:rPr>
-          <w:b/>
-          <w:bCs/>
-          <w:color w:val="1A1A2E"/>
-        </w:rPr>
-        <w:t xml:space="preserve"> Deposit </w:t>
-      </w:r>
-      <w:proofErr w:type="spellStart"/>
-      <w:r>
-        <w:rPr>
-          <w:b/>
-          <w:bCs/>
-          <w:color w:val="1A1A2E"/>
-        </w:rPr>
-        <w:t>Jaminan</w:t>
-      </w:r>
-      <w:proofErr w:type="spellEnd"/>
-      <w:r>
-        <w:rPr>
-          <w:b/>
-          <w:bCs/>
-          <w:color w:val="1A1A2E"/>
-        </w:rPr>
-        <w:t xml:space="preserve"> </w:t>
-      </w:r>
-      <w:proofErr w:type="spellStart"/>
-      <w:r>
-        <w:rPr>
-          <w:b/>
-          <w:bCs/>
-          <w:color w:val="1A1A2E"/>
-        </w:rPr>
-        <w:t>Lelang</w:t>
-      </w:r>
-      <w:proofErr w:type="spellEnd"/>
-      <w:r>
-        <w:rPr>
-          <w:color w:val="1A1A2E"/>
-        </w:rPr>
-        <w:t xml:space="preserve">: </w:t>
-      </w:r>
-      <w:r>
-        <w:rPr>
-          <w:b/>
-          <w:bCs/>
-          <w:color w:val="1A1A2E"/>
-        </w:rPr>
-        <w:t>PIHAK PERTAMA</w:t>
-      </w:r>
-      <w:r>
-        <w:rPr>
-          <w:color w:val="1A1A2E"/>
-        </w:rPr>
-        <w:t xml:space="preserve"> </w:t>
-      </w:r>
-      <w:proofErr w:type="spellStart"/>
-      <w:r>
-        <w:rPr>
-          <w:color w:val="1A1A2E"/>
-        </w:rPr>
-        <w:t>wajib</w:t>
-      </w:r>
-      <w:proofErr w:type="spellEnd"/>
-      <w:r>
-        <w:rPr>
-          <w:color w:val="1A1A2E"/>
-        </w:rPr>
-        <w:t xml:space="preserve"> </w:t>
-      </w:r>
-      <w:proofErr w:type="spellStart"/>
-      <w:r>
-        <w:rPr>
-          <w:color w:val="1A1A2E"/>
-        </w:rPr>
-        <w:t>menyetorkan</w:t>
-      </w:r>
-      <w:proofErr w:type="spellEnd"/>
-      <w:r>
-        <w:rPr>
-          <w:color w:val="1A1A2E"/>
-        </w:rPr>
-        <w:t xml:space="preserve"> </w:t>
-      </w:r>
-      <w:proofErr w:type="spellStart"/>
-      <w:r>
-        <w:rPr>
-          <w:color w:val="1A1A2E"/>
-        </w:rPr>
-        <w:t>Uang</w:t>
-      </w:r>
-      <w:proofErr w:type="spellEnd"/>
-      <w:r>
-        <w:rPr>
-          <w:color w:val="1A1A2E"/>
-        </w:rPr>
-        <w:t xml:space="preserve"> Deposit </w:t>
-      </w:r>
-      <w:proofErr w:type="spellStart"/>
-      <w:r>
-        <w:rPr>
-          <w:color w:val="1A1A2E"/>
-        </w:rPr>
-        <w:t>Jaminan</w:t>
-      </w:r>
-      <w:proofErr w:type="spellEnd"/>
-      <w:r>
-        <w:rPr>
-          <w:color w:val="1A1A2E"/>
-        </w:rPr>
-        <w:t xml:space="preserve"> </w:t>
-      </w:r>
-      <w:proofErr w:type="spellStart"/>
-      <w:r>
-        <w:rPr>
-          <w:color w:val="1A1A2E"/>
-        </w:rPr>
-        <w:t>Lelang</w:t>
-      </w:r>
-      <w:proofErr w:type="spellEnd"/>
-      <w:r>
-        <w:rPr>
-          <w:color w:val="1A1A2E"/>
-        </w:rPr>
-        <w:t xml:space="preserve"> </w:t>
-      </w:r>
-      <w:proofErr w:type="spellStart"/>
-      <w:r>
-        <w:rPr>
-          <w:color w:val="1A1A2E"/>
-        </w:rPr>
-        <w:t>sebesar</w:t>
-      </w:r>
-      <w:proofErr w:type="spellEnd"/>
-      <w:r>
-        <w:rPr>
-          <w:color w:val="1A1A2E"/>
-        </w:rPr>
-        <w:t xml:space="preserve"> </w:t>
-      </w:r>
-      <w:proofErr w:type="spellStart"/>
-      <w:r>
-        <w:rPr>
-          <w:b/>
-          <w:bCs/>
-          <w:color w:val="1A1A2E"/>
-        </w:rPr>
-        <w:t>Rp</w:t>
-      </w:r>
-      <w:proofErr w:type="spellEnd"/>
-      <w:r>
-        <w:rPr>
-          <w:b/>
-          <w:bCs/>
-          <w:color w:val="1A1A2E"/>
-        </w:rPr>
-        <w:t>.</w:t>
-      </w:r>
-      <w:r>
-        <w:rPr>
-          <w:b/>
-          <w:bCs/>
-          <w:color w:val="1A1A2E"/>
-        </w:rPr>
-        <w:t xml:space="preserve"> </w:t>
-      </w:r>
-      <w:r>
-        <w:rPr>
-          <w:b/>
-          <w:bCs/>
-          <w:color w:val="1A1A2E"/>
-        </w:rPr>
-        <w:t>{{</w:t>
-      </w:r>
-      <w:proofErr w:type="spellStart"/>
-      <w:r>
-        <w:rPr>
-          <w:b/>
-          <w:bCs/>
-          <w:color w:val="1A1A2E"/>
-        </w:rPr>
-        <w:t>uang_jaminan</w:t>
-      </w:r>
-      <w:proofErr w:type="spellEnd"/>
-      <w:r>
-        <w:rPr>
-          <w:b/>
-          <w:bCs/>
-          <w:color w:val="1A1A2E"/>
-        </w:rPr>
-        <w:t>}}</w:t>
+      <w:r>
+        <w:rPr>
+          <w:color w:val="1A1A2E"/>
+        </w:rPr>
+        <w:t xml:space="preserve">Selanjutnya, ketika sudah dijadwalkan lelang, </w:t>
+      </w:r>
+      <w:r>
+        <w:rPr>
+          <w:b/>
+          <w:bCs/>
+          <w:color w:val="1A1A2E"/>
+        </w:rPr>
+        <w:t xml:space="preserve">PIHAK PERTAMA</w:t>
+      </w:r>
+      <w:r>
+        <w:rPr>
+          <w:color w:val="1A1A2E"/>
+        </w:rPr>
+        <w:t xml:space="preserve"> juga akan memberikan Uang Deposit Jaminan Lelang sebesar </w:t>
+      </w:r>
+      <w:r>
+        <w:rPr>
+          <w:b/>
+          <w:bCs/>
+          <w:color w:val="1A1A2E"/>
+        </w:rPr>
+        <w:t xml:space="preserve">Rp. </w:t>
+      </w:r>
+      <w:r>
+        <w:rPr>
+          <w:b/>
+          <w:bCs/>
+          <w:color w:val="1A1A2E"/>
+        </w:rPr>
+        <w:t xml:space="preserve">{{uang_jaminan}}</w:t>
       </w:r>
       <w:r>
         <w:rPr>
@@ -7256,223 +6798,41 @@
         <w:rPr>
           <w:color w:val="1A1A2E"/>
         </w:rPr>
-        <w:t>{{</w:t>
-      </w:r>
-      <w:proofErr w:type="spellStart"/>
-      <w:r>
-        <w:rPr>
-          <w:color w:val="1A1A2E"/>
-        </w:rPr>
-        <w:t>terbilang_uang_jaminan</w:t>
-      </w:r>
-      <w:proofErr w:type="spellEnd"/>
-      <w:r>
-        <w:rPr>
-          <w:color w:val="1A1A2E"/>
-        </w:rPr>
-        <w:t>}}</w:t>
-      </w:r>
-      <w:r>
-        <w:rPr>
-          <w:color w:val="1A1A2E"/>
-        </w:rPr>
-        <w:t xml:space="preserve">), </w:t>
-      </w:r>
-      <w:proofErr w:type="spellStart"/>
-      <w:r>
-        <w:rPr>
-          <w:color w:val="1A1A2E"/>
-        </w:rPr>
-        <w:t>atau</w:t>
-      </w:r>
-      <w:proofErr w:type="spellEnd"/>
-      <w:r>
-        <w:rPr>
-          <w:color w:val="1A1A2E"/>
-        </w:rPr>
-        <w:t xml:space="preserve"> </w:t>
-      </w:r>
-      <w:proofErr w:type="spellStart"/>
-      <w:r>
-        <w:rPr>
-          <w:color w:val="1A1A2E"/>
-        </w:rPr>
-        <w:t>sesuai</w:t>
-      </w:r>
-      <w:proofErr w:type="spellEnd"/>
-      <w:r>
-        <w:rPr>
-          <w:color w:val="1A1A2E"/>
-        </w:rPr>
-        <w:t xml:space="preserve"> </w:t>
-      </w:r>
-      <w:proofErr w:type="spellStart"/>
-      <w:r>
-        <w:rPr>
-          <w:color w:val="1A1A2E"/>
-        </w:rPr>
-        <w:t>ketentuan</w:t>
-      </w:r>
-      <w:proofErr w:type="spellEnd"/>
-      <w:r>
-        <w:rPr>
-          <w:color w:val="1A1A2E"/>
-        </w:rPr>
-        <w:t xml:space="preserve"> </w:t>
-      </w:r>
-      <w:proofErr w:type="spellStart"/>
-      <w:r>
-        <w:rPr>
-          <w:color w:val="1A1A2E"/>
-        </w:rPr>
-        <w:t>lelang</w:t>
-      </w:r>
-      <w:proofErr w:type="spellEnd"/>
-      <w:r>
-        <w:rPr>
-          <w:color w:val="1A1A2E"/>
-        </w:rPr>
-        <w:t xml:space="preserve"> yang </w:t>
-      </w:r>
-      <w:proofErr w:type="spellStart"/>
-      <w:r>
-        <w:rPr>
-          <w:color w:val="1A1A2E"/>
-        </w:rPr>
-        <w:t>berlaku</w:t>
-      </w:r>
-      <w:proofErr w:type="spellEnd"/>
-      <w:r>
-        <w:rPr>
-          <w:color w:val="1A1A2E"/>
-        </w:rPr>
-        <w:t xml:space="preserve">, </w:t>
-      </w:r>
-      <w:proofErr w:type="spellStart"/>
-      <w:r>
-        <w:rPr>
-          <w:color w:val="1A1A2E"/>
-        </w:rPr>
-        <w:t>langsung</w:t>
-      </w:r>
-      <w:proofErr w:type="spellEnd"/>
-      <w:r>
-        <w:rPr>
-          <w:color w:val="1A1A2E"/>
-        </w:rPr>
-        <w:t xml:space="preserve"> </w:t>
-      </w:r>
-      <w:proofErr w:type="spellStart"/>
-      <w:r>
-        <w:rPr>
-          <w:color w:val="1A1A2E"/>
-        </w:rPr>
-        <w:t>ke</w:t>
-      </w:r>
-      <w:proofErr w:type="spellEnd"/>
-      <w:r>
-        <w:rPr>
-          <w:color w:val="1A1A2E"/>
-        </w:rPr>
-        <w:t xml:space="preserve"> </w:t>
-      </w:r>
-      <w:proofErr w:type="spellStart"/>
-      <w:r>
-        <w:rPr>
-          <w:color w:val="1A1A2E"/>
-        </w:rPr>
-        <w:t>rekening</w:t>
-      </w:r>
-      <w:proofErr w:type="spellEnd"/>
-      <w:r>
-        <w:rPr>
-          <w:color w:val="1A1A2E"/>
-        </w:rPr>
-        <w:t xml:space="preserve"> </w:t>
-      </w:r>
-      <w:r>
-        <w:rPr>
-          <w:b/>
-          <w:bCs/>
-          <w:color w:val="1A1A2E"/>
-        </w:rPr>
-        <w:t>Virtual Account KPKNL</w:t>
-      </w:r>
-      <w:r>
-        <w:rPr>
-          <w:color w:val="1A1A2E"/>
-        </w:rPr>
-        <w:t xml:space="preserve"> </w:t>
-      </w:r>
-      <w:proofErr w:type="spellStart"/>
-      <w:r>
-        <w:rPr>
-          <w:color w:val="1A1A2E"/>
-        </w:rPr>
-        <w:t>apabila</w:t>
-      </w:r>
-      <w:proofErr w:type="spellEnd"/>
-      <w:r>
-        <w:rPr>
-          <w:color w:val="1A1A2E"/>
-        </w:rPr>
-        <w:t xml:space="preserve"> </w:t>
-      </w:r>
-      <w:proofErr w:type="spellStart"/>
-      <w:r>
-        <w:rPr>
-          <w:color w:val="1A1A2E"/>
-        </w:rPr>
-        <w:t>jadwal</w:t>
-      </w:r>
-      <w:proofErr w:type="spellEnd"/>
-      <w:r>
-        <w:rPr>
-          <w:color w:val="1A1A2E"/>
-        </w:rPr>
-        <w:t xml:space="preserve"> </w:t>
-      </w:r>
-      <w:proofErr w:type="spellStart"/>
-      <w:r>
-        <w:rPr>
-          <w:color w:val="1A1A2E"/>
-        </w:rPr>
-        <w:t>lelang</w:t>
-      </w:r>
-      <w:proofErr w:type="spellEnd"/>
-      <w:r>
-        <w:rPr>
-          <w:color w:val="1A1A2E"/>
-        </w:rPr>
-        <w:t xml:space="preserve"> </w:t>
-      </w:r>
-      <w:proofErr w:type="spellStart"/>
-      <w:r>
-        <w:rPr>
-          <w:color w:val="1A1A2E"/>
-        </w:rPr>
-        <w:t>telah</w:t>
-      </w:r>
-      <w:proofErr w:type="spellEnd"/>
-      <w:r>
-        <w:rPr>
-          <w:color w:val="1A1A2E"/>
-        </w:rPr>
-        <w:t xml:space="preserve"> </w:t>
-      </w:r>
-      <w:proofErr w:type="spellStart"/>
-      <w:r>
-        <w:rPr>
-          <w:color w:val="1A1A2E"/>
-        </w:rPr>
-        <w:t>ditetapkan</w:t>
-      </w:r>
-      <w:proofErr w:type="spellEnd"/>
-      <w:r>
-        <w:rPr>
-          <w:color w:val="1A1A2E"/>
-        </w:rPr>
-        <w:t>.</w:t>
+        <w:t xml:space="preserve">{{terbilang_uang_jaminan}}</w:t>
+      </w:r>
+      <w:r>
+        <w:rPr>
+          <w:color w:val="1A1A2E"/>
+        </w:rPr>
+        <w:t xml:space="preserve">) atau sesuai Ketentuan Lelang yang berlaku dan Uang Deposit Jaminan Lelang tersebut akan disetorkan oleh </w:t>
+      </w:r>
+      <w:r>
+        <w:rPr>
+          <w:b/>
+          <w:bCs/>
+          <w:color w:val="1A1A2E"/>
+        </w:rPr>
+        <w:t xml:space="preserve">PIHAK PERTAMA</w:t>
+      </w:r>
+      <w:r>
+        <w:rPr>
+          <w:color w:val="1A1A2E"/>
+        </w:rPr>
+        <w:t xml:space="preserve"> ke rekening Virtual Account </w:t>
+      </w:r>
+      <w:r>
+        <w:rPr>
+          <w:b/>
+          <w:bCs/>
+          <w:color w:val="1A1A2E"/>
+        </w:rPr>
+        <w:t xml:space="preserve">KPKNL</w:t>
+      </w:r>
+      <w:r>
+        <w:rPr>
+          <w:color w:val="1A1A2E"/>
+        </w:rPr>
+        <w:t xml:space="preserve"> apabila sudah aktif.</w:t>
       </w:r>
     </w:p>
     <w:p>

</xml_diff>